<commit_message>
updated until chapter 3
</commit_message>
<xml_diff>
--- a/FinalProject/DL_AblationStudy_DavidAviad.docx
+++ b/FinalProject/DL_AblationStudy_DavidAviad.docx
@@ -540,7 +540,7 @@
     </w:p>
     <w:p>
       <w:pPr>
-        <w:pStyle w:val="Heading1"/>
+        <w:pStyle w:val="1"/>
       </w:pPr>
       <w:r>
         <w:t>Introduction</w:t>
@@ -548,49 +548,34 @@
     </w:p>
     <w:p>
       <w:pPr>
-        <w:pStyle w:val="BodyText"/>
-        <w:rPr>
-          <w:lang/>
-        </w:rPr>
-      </w:pPr>
-      <w:r>
-        <w:rPr>
-          <w:lang/>
-        </w:rPr>
+        <w:pStyle w:val="a3"/>
+      </w:pPr>
+      <w:r>
         <w:t>The performance of a convolutional neural network (CNN) is influenced not only by its architecture but also by the selection of training hyperparameters. Among these, the learning rate, optimization algorithm, and batch size have a direct impact on convergence, training stability, and predictive performance. Although these hyperparameters are routinely tuned during model development, their individual contributions are often difficult to evaluate because multiple parameters are frequently modified simultaneously.</w:t>
       </w:r>
     </w:p>
     <w:p>
       <w:pPr>
-        <w:pStyle w:val="BodyText"/>
-        <w:rPr>
-          <w:lang/>
-        </w:rPr>
-      </w:pPr>
-      <w:r>
-        <w:rPr>
-          <w:lang/>
-        </w:rPr>
+        <w:pStyle w:val="a3"/>
+      </w:pPr>
+      <w:r>
         <w:t>This study presents a controlled ablation analysis in which only one hyperparameter is varied at a time while all other training conditions remain unchanged. Such an approach enables a systematic comparison of the influence of each hyperparameter on both the optimization process and the final model performance. The experiments were conducted using a fixed CNN architecture on a binary classification task derived from the Fashion-MNIST dataset, with independent evaluations of learning rate, optimizer, and batch size.</w:t>
       </w:r>
     </w:p>
     <w:p>
       <w:pPr>
-        <w:pStyle w:val="BodyText"/>
+        <w:pStyle w:val="a3"/>
         <w:rPr>
           <w:lang w:val="en-US"/>
         </w:rPr>
       </w:pPr>
       <w:r>
-        <w:rPr>
-          <w:lang/>
-        </w:rPr>
         <w:t>Model performance was assessed using standard classification metrics, including Accuracy, Precision, Recall, Specificity, F1-score, ROC-AUC, and confusion matrices. In addition, internal training dynamics were investigated by monitoring changes in network weights throughout the optimization process. Rather than proposing a new network architecture, the objective of this work is to improve the understanding of how fundamental training hyperparameters influence CNN training under controlled experimental conditions.</w:t>
       </w:r>
     </w:p>
     <w:p>
       <w:pPr>
-        <w:pStyle w:val="Heading1"/>
+        <w:pStyle w:val="1"/>
       </w:pPr>
       <w:r>
         <w:t>Methodology</w:t>
@@ -598,7 +583,7 @@
     </w:p>
     <w:p>
       <w:pPr>
-        <w:pStyle w:val="Heading2"/>
+        <w:pStyle w:val="2"/>
       </w:pPr>
       <w:r>
         <w:t>Dataset</w:t>
@@ -606,129 +591,214 @@
     </w:p>
     <w:p>
       <w:pPr>
-        <w:pStyle w:val="BodyText"/>
-      </w:pPr>
-      <w:r>
-        <w:t xml:space="preserve">First, confirm that you have the correct template for your paper size. This template has been tailored for output on the </w:t>
-      </w:r>
-      <w:r>
+        <w:pStyle w:val="a3"/>
+        <w:rPr>
+          <w:rFonts w:hint="cs"/>
+        </w:rPr>
+      </w:pPr>
+      <w:r>
+        <w:t xml:space="preserve">For this study, the Fashion-MNIST dataset (Xiao et al., 2017) was selected to evaluate a binary classification model focused on distinguishing between two visually similar classes: T-shirt/top and Shirt. This dataset provides an ideal </w:t>
+      </w:r>
+      <w:r>
+        <w:t>level of intermediate complexity; by utilizing images of apparel rather than simple handwritten digits, it offers a more rigorous benchmark for assessing a model's ability to extract non-trivial visual features compared to the traditional MNIST dataset, which is widely considered trivial for modern architectures. Simultaneously, it remains more computationally tractable than heavier datasets like CIFAR-10.</w:t>
+      </w:r>
+    </w:p>
+    <w:p>
+      <w:pPr>
+        <w:pStyle w:val="a3"/>
+        <w:rPr>
+          <w:rFonts w:hint="cs"/>
+          <w:lang w:bidi="he-IL"/>
+        </w:rPr>
+      </w:pPr>
+      <w:r>
+        <w:t>The decision to isolate two analogous categories elevates the difficulty of the task, as the morphological differences between a T-shirt/top and a shirt are subtle rather than sharply defined. Furthermore, from a methodological standpoint, structuring this specific challenge as a binary classification problem—rather than a multi-class one—facilitates the straightforward and robust calculation of fundamental evaluation metrics. This binary framework enables a clear, comprehensive presentation of True Positives (TP), False Positives (FP), True Negatives (TN), False Negatives (FN), Accuracy, Precision, Recall, Specificity, F1 Score, and ROC-AUC.</w:t>
+      </w:r>
+    </w:p>
+    <w:p>
+      <w:pPr>
+        <w:pStyle w:val="2"/>
+      </w:pPr>
+      <w:r>
+        <w:t>CNN Architecture</w:t>
+      </w:r>
+    </w:p>
+    <w:p>
+      <w:pPr>
+        <w:pStyle w:val="a3"/>
+        <w:rPr>
+          <w:lang w:bidi="he-IL"/>
+        </w:rPr>
+      </w:pPr>
+      <w:r>
+        <w:rPr>
+          <w:lang w:bidi="he-IL"/>
+        </w:rPr>
+        <w:t>For all experiments in this study, a consistent and compact Convolutional Neural Network (CNN) architecture is employed. The model processes 28x28x1 input images through an initial 2D convolutional layer comprising 32 filters of size 3x3, utilizing a default stride of 1 and valid padding. This is immediately followed by a non-linear activation using ReLU and spatial downsampling via a 2x2 MaxPooling layer. An identical pattern of convolution (64 filters of size 3x3), ReLU activation, and 2x2 max-pooling is subsequently applied to extract deeper, more abstract features. The resulting feature maps are then flattened and passed through a fully connected dense layer containing 64 neurons with ReLU activation. The network culminates in a single-neuron output layer utilizing a sigmoid activation function, a standard mathematical formulation for mapping outputs to a probability distribution in binary classification tasks (Goodfellow et al., 2016).</w:t>
+      </w:r>
+    </w:p>
+    <w:p>
+      <w:pPr>
+        <w:pStyle w:val="a3"/>
+        <w:rPr>
+          <w:lang w:bidi="he-IL"/>
+        </w:rPr>
+      </w:pPr>
+      <w:r>
+        <w:rPr>
+          <w:lang w:bidi="he-IL"/>
+        </w:rPr>
+        <w:t xml:space="preserve">The selection of a CNN framework is fundamentally suited for image-based data, as convolutional operations inherently excel at learning local spatial hierarchies and extracting representations such as edges, textures, and morphological shapes (LeCun et al., 1998; Krizhevsky et al., 2012). Furthermore, the integration of max-pooling systematically reduces spatial dimensionality, enabling the </w:t>
+      </w:r>
+      <w:r>
+        <w:rPr>
+          <w:lang w:bidi="he-IL"/>
+        </w:rPr>
+        <w:lastRenderedPageBreak/>
+        <w:t>network to isolate the most salient features while mitigating computational demands. With approximately 121,000 trainable parameters, this specific architecture was designed to provide an empirically sound balance. It possesses sufficient complexity to serve as a rigorous subject for evaluating neural network behavior, yet its relatively modest footprint prevents excessive computational overhead. Consequently, this design allows for the execution of multiple robust experimental iterations within a practical timeframe, avoiding analytical bottlenecking</w:t>
+      </w:r>
+      <w:r>
+        <w:t>.</w:t>
+      </w:r>
+    </w:p>
+    <w:p>
+      <w:pPr>
+        <w:pStyle w:val="2"/>
+      </w:pPr>
+      <w:r>
+        <w:t>Experimental Protocol</w:t>
+      </w:r>
+    </w:p>
+    <w:p>
+      <w:pPr>
+        <w:pStyle w:val="a3"/>
+        <w:rPr>
+          <w:rFonts w:hint="cs"/>
+        </w:rPr>
+      </w:pPr>
+      <w:r>
+        <w:t>To ensure a rigorous and equitable empirical comparison across experiments, a standardized baseline configuration was established, allowing for a controlled variable approach where only a single hyperparameter is modified per iteration. The baseline Convolutional Neural Network is trained on a strictly balanced (50/50) binary subset of Fashion-MNIST (T-shirt/top versus Shirt), utilizing an 80-10-10 data split. The architecture employs ReLU activations in hidden layers and a Sigmoid output, optimized via the Adam algorithm with a default learning rate of 0.001, a batch size of 64, and Binary Cross-Entropy loss, with training regulated by early stopping based on validation loss. Building upon this foundation, a systematic sensitivity analysis was conducted on three pivotal hyperparameters—Learning Rate, Optimizer, and Batch Size—chosen for their profound influence on training dynamics, convergence velocity, and ultimate model efficacy.</w:t>
+      </w:r>
+    </w:p>
+    <w:p>
+      <w:pPr>
+        <w:pStyle w:val="a3"/>
+        <w:rPr>
+          <w:rFonts w:hint="cs"/>
+        </w:rPr>
+      </w:pPr>
+      <w:r>
+        <w:t>The first two phases of the sensitivity analysis focus on the optimization process. Evaluating varied learning rates (0.1, 0.05, 0.01, and 0.001) provides insight into how gradient step sizes dictate loss reduction trajectories and stability, balancing the risks of divergence caused by excessively high rates against the protracted convergence characteristic of lower rates (Goodfellow et al., 2016). Concurrently, a comparative evaluation of Standard Stochastic Gradient Descent (SGD), SGD with Momentum (Sutskever et al., 2013), RMSprop (Tieleman and Hinton, 2012), and Adam (Kingma and Ba, 2014) highlights how distinct mathematical update mechanisms alter convergence speed and local minima discovery. This experimental phase is designed to evaluate the specific empirical benefits of momentum and adaptive learning rates over standard stochastic updates.</w:t>
+      </w:r>
+    </w:p>
+    <w:p>
+      <w:pPr>
+        <w:pStyle w:val="a3"/>
+        <w:rPr>
+          <w:rFonts w:hint="cs"/>
+          <w:lang w:bidi="he-IL"/>
+        </w:rPr>
+      </w:pPr>
+      <w:r>
+        <w:t>The final phase examines the impact of batch sizes (16, 32, 64, and 128) on the inherent stochasticity of weight updates. Smaller batches yield frequent, noisier gradient estimates that have been empirically shown to act as an implicit regularizer, potentially enhancing model generalization (Keskar et al., 2016). In contrast, larger batches provide more stable gradient approximations but may constrain optimization flexibility. This systematic evaluation aims to isolate the specific effects of training subset size on loss volatility, test set performance, convergence rates, and the overall robustness of parametric shifts.</w:t>
+      </w:r>
+    </w:p>
+    <w:p>
+      <w:pPr>
+        <w:pStyle w:val="2"/>
+      </w:pPr>
+      <w:r>
+        <w:t>Evaluation Metrics</w:t>
+      </w:r>
+    </w:p>
+    <w:p>
+      <w:pPr>
+        <w:pStyle w:val="a3"/>
+        <w:rPr>
+          <w:lang w:bidi="he-IL"/>
+        </w:rPr>
+      </w:pPr>
+      <w:r>
+        <w:rPr>
+          <w:lang w:bidi="he-IL"/>
+        </w:rPr>
+        <w:t xml:space="preserve">The evaluation framework for each experimental iteration encompasses three distinct categories designed to capture the learning trajectory, predictive efficacy, and internal parametric behavior of the models. The first category focuses on convergence dynamics, continuously monitoring the training loss and validation loss across all epochs. To evaluate optimization efficiency and training stability, the analysis also records the total number of epochs required to reach </w:t>
+      </w:r>
+      <w:r>
+        <w:rPr>
+          <w:lang w:bidi="he-IL"/>
+        </w:rPr>
+        <w:t>convergence, alongside identifying the specific epoch at which the optimal validation loss was achieved.</w:t>
+      </w:r>
+    </w:p>
+    <w:p>
+      <w:pPr>
+        <w:pStyle w:val="a3"/>
+        <w:rPr>
+          <w:lang w:bidi="he-IL"/>
+        </w:rPr>
+      </w:pPr>
+      <w:r>
+        <w:rPr>
+          <w:lang w:bidi="he-IL"/>
+        </w:rPr>
+        <w:t>The second category evaluates the external performance and predictive accuracy of the final models. This is accomplished through a comprehensive suite of standard binary classification metrics derived from the confusion matrix, specifically True Positives (TP), False Positives (FP), True Negatives (TN), and False Negatives (FN). To provide a robust and multi-faceted assessment of model performance, these foundational parameters are utilized to calculate Accuracy, Precision, Recall, Specificity, the F1 Score, and the Area Under the Receiver Operating Characteristic Curve (ROC-AUC) (Fawcett, 2006).</w:t>
+      </w:r>
+    </w:p>
+    <w:p>
+      <w:pPr>
+        <w:pStyle w:val="a3"/>
+        <w:rPr>
+          <w:rFonts w:hint="cs"/>
+          <w:lang w:bidi="he-IL"/>
+        </w:rPr>
+      </w:pPr>
+      <w:r>
+        <w:rPr>
+          <w:lang w:bidi="he-IL"/>
+        </w:rPr>
+        <w:t>Finally, beyond standard predictive evaluations, the study introduces a third metric category focusing on internal network dynamics to examine the actual parametric evolution during training. This micro-level analysis tracks weight updates across layers by calculating the mean weight change, the mean and median absolute weight changes, and the cumulative sum of absolute weight alterations. Additionally, it isolates the single most volatile weight and the top three most volatile weights, cross-referencing them across epochs to identify consistently unstable parameters. By quantifying these parameter update dynamics, this approach offers enhanced interpretability, shifting the analytical focus from mere classification outputs to a comprehensive, mechanistic understanding of the network's internal learning process</w:t>
+      </w:r>
+      <w:r>
+        <w:rPr>
+          <w:rFonts w:hint="cs"/>
+          <w:rtl/>
+          <w:lang w:bidi="he-IL"/>
+        </w:rPr>
+        <w:t>.</w:t>
+      </w:r>
+    </w:p>
+    <w:p>
+      <w:pPr>
+        <w:pStyle w:val="1"/>
+      </w:pPr>
+      <w:r>
+        <w:t>Experimental Setup</w:t>
+      </w:r>
+    </w:p>
+    <w:p>
+      <w:pPr>
+        <w:pStyle w:val="a3"/>
         <w:rPr>
           <w:lang w:val="en-US"/>
         </w:rPr>
-        <w:t>A4</w:t>
-      </w:r>
-      <w:r>
-        <w:t xml:space="preserve"> paper size. If you are using </w:t>
+      </w:pPr>
+      <w:r>
+        <w:t>Before</w:t>
+      </w:r>
+      <w:r>
+        <w:t xml:space="preserve"> you begin to format your paper, first write and save the content as a separate text file. </w:t>
       </w:r>
       <w:r>
         <w:rPr>
           <w:lang w:val="en-US"/>
         </w:rPr>
-        <w:t>US letter</w:t>
-      </w:r>
-      <w:r>
-        <w:t>-sized paper, please close this</w:t>
-      </w:r>
-      <w:r>
-        <w:t xml:space="preserve"> file and download the </w:t>
-      </w:r>
-      <w:r>
-        <w:rPr>
-          <w:lang w:val="en-US"/>
-        </w:rPr>
-        <w:t xml:space="preserve">Microsoft Word, Letter </w:t>
-      </w:r>
-      <w:r>
-        <w:t>file</w:t>
-      </w:r>
-      <w:r>
-        <w:t>.</w:t>
-      </w:r>
-    </w:p>
-    <w:p>
-      <w:pPr>
-        <w:pStyle w:val="Heading2"/>
-      </w:pPr>
-      <w:r>
-        <w:t>CNN Architecture</w:t>
-      </w:r>
-    </w:p>
-    <w:p>
-      <w:pPr>
-        <w:pStyle w:val="BodyText"/>
-      </w:pPr>
-      <w:r>
-        <w:t>The template is used to format your paper and style the text. All margins, column widths, line spaces, and text fonts are prescribed; please do not alter them. You may note peculiarities. For example, the head margin in this template measures proportionately more than is customary. This measurement and others are deliberate, using specifications that anticipate your paper as one part of the entire proceedings, and not as an independent document. Please do not revise any of the current designations.</w:t>
-      </w:r>
-    </w:p>
-    <w:p>
-      <w:pPr>
-        <w:pStyle w:val="Heading2"/>
-      </w:pPr>
-      <w:r>
-        <w:t>Experimental Protocol</w:t>
-      </w:r>
-    </w:p>
-    <w:p>
-      <w:pPr>
-        <w:pStyle w:val="BodyText"/>
-      </w:pPr>
-      <w:r>
-        <w:t>The template is used to format your paper and style the text. All margins, column widths, line spaces, and text fonts are prescribed; please do not alter them. You may note peculiarities. For example, the head margin in this template measures proportionately more than is customary. This measurement and others are deliberate, using specifications that anticipate your paper as one part of the entire proceedings, and not as an independent document. Please do not revise any of the current designations.</w:t>
-      </w:r>
-    </w:p>
-    <w:p>
-      <w:pPr>
-        <w:pStyle w:val="Heading2"/>
-      </w:pPr>
-      <w:r>
-        <w:t>Evaluation Metrics</w:t>
-      </w:r>
-    </w:p>
-    <w:p>
-      <w:pPr>
-        <w:pStyle w:val="BodyText"/>
-      </w:pPr>
-      <w:r>
-        <w:t>The template is used to format your paper and style the text. All margins, column widths, line spaces, and text fonts are prescribed; please do not alter them. You may note peculiarities. For example, the head margin in this template measures proportionately more than is customary. This measurement and others are deliberate, using specifications that anticipate your paper as one part of the entire proceedings, and not as an independent document. Please do not revise any of the current designations.</w:t>
-      </w:r>
-    </w:p>
-    <w:p>
-      <w:pPr>
-        <w:pStyle w:val="BodyText"/>
-      </w:pPr>
-    </w:p>
-    <w:p>
-      <w:pPr>
-        <w:pStyle w:val="Heading1"/>
-      </w:pPr>
-      <w:r>
-        <w:t>Experimental Setup</w:t>
-      </w:r>
-    </w:p>
-    <w:p>
-      <w:pPr>
-        <w:pStyle w:val="BodyText"/>
-        <w:rPr>
-          <w:lang w:val="en-US"/>
-        </w:rPr>
-      </w:pPr>
-      <w:r>
-        <w:t>Before</w:t>
-      </w:r>
-      <w:r>
-        <w:t xml:space="preserve"> you begin to format your paper, first write and save the content as a separate text file. </w:t>
-      </w:r>
-      <w:r>
-        <w:rPr>
-          <w:lang w:val="en-US"/>
-        </w:rPr>
         <w:t>Complete all content and organizational editing before formatting. Please note sections A-D below for more information on proofreading, spelling and grammar.</w:t>
       </w:r>
     </w:p>
     <w:p>
       <w:pPr>
-        <w:pStyle w:val="BodyText"/>
+        <w:pStyle w:val="a3"/>
       </w:pPr>
       <w:r>
         <w:t>Keep your text and graphic files separate until after the text has been formatted and styled. Do not use hard tabs, and limit use of hard returns to only one return at the end of a paragraph. Do not add any kind of pagination anywhere in the paper. Do not number text heads-the template will do that for you.</w:t>
@@ -736,60 +806,63 @@
     </w:p>
     <w:p>
       <w:pPr>
-        <w:pStyle w:val="Heading2"/>
-      </w:pPr>
+        <w:pStyle w:val="2"/>
+      </w:pPr>
+      <w:r>
+        <w:t>Abbreviations</w:t>
+      </w:r>
+      <w:r>
+        <w:t xml:space="preserve"> and Acronyms</w:t>
+      </w:r>
+    </w:p>
+    <w:p>
+      <w:pPr>
+        <w:pStyle w:val="a3"/>
+      </w:pPr>
+      <w:r>
+        <w:t>Define abbreviations and acronyms the first time they are used in the text, even after they have been defined in the abstract. Abbreviations such as IEEE, SI, MKS, CGS, sc, dc, and rms do not have to be defined. Do not use abbreviations in the title or heads unless they are unavoidable.</w:t>
+      </w:r>
+    </w:p>
+    <w:p>
+      <w:pPr>
+        <w:pStyle w:val="2"/>
+      </w:pPr>
+      <w:r>
+        <w:t>Units</w:t>
+      </w:r>
+    </w:p>
+    <w:p>
+      <w:pPr>
+        <w:pStyle w:val="bulletlist"/>
+      </w:pPr>
+      <w:r>
+        <w:t xml:space="preserve">Use </w:t>
+      </w:r>
+      <w:r>
+        <w:t>either</w:t>
+      </w:r>
+      <w:r>
+        <w:t xml:space="preserve"> SI (MKS) or CGS as primary units. (SI units are encouraged.) English units may be used as secondary units (in parentheses). An exception would be the use of English units as identifiers in trade, such as “3.5-inch disk drive”.</w:t>
+      </w:r>
+    </w:p>
+    <w:p>
+      <w:pPr>
+        <w:pStyle w:val="bulletlist"/>
+      </w:pPr>
+      <w:r>
+        <w:t>Avoid combining SI and CGS units, such as current in amperes and magnetic field in oersteds. This often leads to confusion because equations do not balance dimensionally. If you must use mixed units, clearly state the units for each quantity that you use in an equation.</w:t>
+      </w:r>
+    </w:p>
+    <w:p>
+      <w:pPr>
+        <w:pStyle w:val="bulletlist"/>
+      </w:pPr>
+      <w:r>
+        <w:t xml:space="preserve">Do not mix complete spellings and abbreviations of units: “Wb/m2” or “webers per square meter”, not </w:t>
+      </w:r>
       <w:r>
         <w:lastRenderedPageBreak/>
-        <w:t>Abbreviations</w:t>
-      </w:r>
-      <w:r>
-        <w:t xml:space="preserve"> and Acronyms</w:t>
-      </w:r>
-    </w:p>
-    <w:p>
-      <w:pPr>
-        <w:pStyle w:val="BodyText"/>
-      </w:pPr>
-      <w:r>
-        <w:t>Define abbreviations and acronyms the first time they are used in the text, even after they have been defined in the abstract. Abbreviations such as IEEE, SI, MKS, CGS, sc, dc, and rms do not have to be defined. Do not use abbreviations in the title or heads unless they are unavoidable.</w:t>
-      </w:r>
-    </w:p>
-    <w:p>
-      <w:pPr>
-        <w:pStyle w:val="Heading2"/>
-      </w:pPr>
-      <w:r>
-        <w:t>Units</w:t>
-      </w:r>
-    </w:p>
-    <w:p>
-      <w:pPr>
-        <w:pStyle w:val="bulletlist"/>
-      </w:pPr>
-      <w:r>
-        <w:t xml:space="preserve">Use </w:t>
-      </w:r>
-      <w:r>
-        <w:t>either</w:t>
-      </w:r>
-      <w:r>
-        <w:t xml:space="preserve"> SI (MKS) or CGS as primary units. (SI units are encouraged.) English units may be used as secondary units (in parentheses). An exception would be the use of English units as identifiers in trade, such as “3.5-inch disk drive”.</w:t>
-      </w:r>
-    </w:p>
-    <w:p>
-      <w:pPr>
-        <w:pStyle w:val="bulletlist"/>
-      </w:pPr>
-      <w:r>
-        <w:t>Avoid combining SI and CGS units, such as current in amperes and magnetic field in oersteds. This often leads to confusion because equations do not balance dimensionally. If you must use mixed units, clearly state the units for each quantity that you use in an equation.</w:t>
-      </w:r>
-    </w:p>
-    <w:p>
-      <w:pPr>
-        <w:pStyle w:val="bulletlist"/>
-      </w:pPr>
-      <w:r>
-        <w:t>Do not mix complete spellings and abbreviations of units: “Wb/m2” or “webers per square meter”, not “webers/m2”.  Spell out units when they appear in text: “. . . a few henries”, not “. . . a few H”.</w:t>
+        <w:t>“webers/m2”.  Spell out units when they appear in text: “. . . a few henries”, not “. . . a few H”.</w:t>
       </w:r>
     </w:p>
     <w:p>
@@ -846,7 +919,7 @@
     </w:p>
     <w:p>
       <w:pPr>
-        <w:pStyle w:val="Heading2"/>
+        <w:pStyle w:val="2"/>
       </w:pPr>
       <w:r>
         <w:t>Equations</w:t>
@@ -854,7 +927,7 @@
     </w:p>
     <w:p>
       <w:pPr>
-        <w:pStyle w:val="BodyText"/>
+        <w:pStyle w:val="a3"/>
       </w:pPr>
       <w:r>
         <w:t>The equations are an exception to the prescribed specifications of this template. You will need to determine whether or not your equation should be typed using either the Times New Roman or the Symbol font (please no other font). To create multileveled equations, it may be necessary to treat the equation as a graphic and insert it into the text after your paper is styled.</w:t>
@@ -862,7 +935,7 @@
     </w:p>
     <w:p>
       <w:pPr>
-        <w:pStyle w:val="BodyText"/>
+        <w:pStyle w:val="a3"/>
         <w:rPr>
           <w:lang w:val="en-US"/>
         </w:rPr>
@@ -940,7 +1013,7 @@
     </w:p>
     <w:p>
       <w:pPr>
-        <w:pStyle w:val="BodyText"/>
+        <w:pStyle w:val="a3"/>
       </w:pPr>
       <w:r>
         <w:t>Note that the equation is centered using a center tab stop. Be sure that the symbols in your equation have been defined before or immediately following the equation. Use “(1)”, not “Eq. (1)” or “equation (1)”, except at the beginning of a sentence: “Equation (1) is . . .”</w:t>
@@ -948,7 +1021,7 @@
     </w:p>
     <w:p>
       <w:pPr>
-        <w:pStyle w:val="Heading2"/>
+        <w:pStyle w:val="2"/>
       </w:pPr>
       <w:r>
         <w:t>Some Common Mistakes</w:t>
@@ -999,10 +1072,7 @@
         <w:t>English, commas, semi</w:t>
       </w:r>
       <w:r>
-        <w:t xml:space="preserve">colons, periods, question and exclamation marks are located within quotation marks only when a complete thought or name is cited, such as a title or full quotation. When </w:t>
-      </w:r>
-      <w:r>
-        <w:t>quotation marks are used, instead of a bold or italic typeface, to highlight a word or phrase, punctuation should appear outside of the quotation marks. A parenthetical phrase or statement at the end of a sentence is punctuated outside of the closing parenthesis (like this). (A parenthetical sentence is punctuated within the parentheses.)</w:t>
+        <w:t>colons, periods, question and exclamation marks are located within quotation marks only when a complete thought or name is cited, such as a title or full quotation. When quotation marks are used, instead of a bold or italic typeface, to highlight a word or phrase, punctuation should appear outside of the quotation marks. A parenthetical phrase or statement at the end of a sentence is punctuated outside of the closing parenthesis (like this). (A parenthetical sentence is punctuated within the parentheses.)</w:t>
       </w:r>
     </w:p>
     <w:p>
@@ -1071,7 +1141,7 @@
     </w:p>
     <w:p>
       <w:pPr>
-        <w:pStyle w:val="BodyText"/>
+        <w:pStyle w:val="a3"/>
       </w:pPr>
       <w:r>
         <w:t>An excellent style manual for science writers is [7].</w:t>
@@ -1079,7 +1149,7 @@
     </w:p>
     <w:p>
       <w:pPr>
-        <w:pStyle w:val="Heading1"/>
+        <w:pStyle w:val="1"/>
       </w:pPr>
       <w:r>
         <w:t>Results</w:t>
@@ -1087,7 +1157,7 @@
     </w:p>
     <w:p>
       <w:pPr>
-        <w:pStyle w:val="BodyText"/>
+        <w:pStyle w:val="a3"/>
       </w:pPr>
       <w:r>
         <w:t>After the text edit has been completed, the paper is ready for the template. Duplicate the template file by using the Save As command, and use the naming convention prescribed by your conference for the name of your paper. In this newly created file, highlight all of the contents and import your prepared text file. You are now ready to style your paper; use the scroll down window on the left of the MS Word Formatting toolbar.</w:t>
@@ -1095,7 +1165,7 @@
     </w:p>
     <w:p>
       <w:pPr>
-        <w:pStyle w:val="Heading2"/>
+        <w:pStyle w:val="2"/>
       </w:pPr>
       <w:r>
         <w:t>Authors</w:t>
@@ -1106,7 +1176,7 @@
     </w:p>
     <w:p>
       <w:pPr>
-        <w:pStyle w:val="BodyText"/>
+        <w:pStyle w:val="a3"/>
       </w:pPr>
       <w:r>
         <w:rPr>
@@ -1194,7 +1264,7 @@
     </w:p>
     <w:p>
       <w:pPr>
-        <w:pStyle w:val="Heading3"/>
+        <w:pStyle w:val="3"/>
       </w:pPr>
       <w:r>
         <w:t xml:space="preserve">For papers with more than six authors: </w:t>
@@ -1208,7 +1278,7 @@
     </w:p>
     <w:p>
       <w:pPr>
-        <w:pStyle w:val="Heading3"/>
+        <w:pStyle w:val="3"/>
       </w:pPr>
       <w:r>
         <w:t xml:space="preserve">For </w:t>
@@ -1234,7 +1304,7 @@
     </w:p>
     <w:p>
       <w:pPr>
-        <w:pStyle w:val="Heading4"/>
+        <w:pStyle w:val="4"/>
       </w:pPr>
       <w:r>
         <w:t>Selection</w:t>
@@ -1251,7 +1321,7 @@
     </w:p>
     <w:p>
       <w:pPr>
-        <w:pStyle w:val="Heading4"/>
+        <w:pStyle w:val="4"/>
       </w:pPr>
       <w:r>
         <w:t>Change number of columns:</w:t>
@@ -1280,13 +1350,12 @@
     </w:p>
     <w:p>
       <w:pPr>
-        <w:pStyle w:val="Heading4"/>
+        <w:pStyle w:val="4"/>
         <w:rPr>
           <w:i w:val="0"/>
         </w:rPr>
       </w:pPr>
       <w:r>
-        <w:lastRenderedPageBreak/>
         <w:t xml:space="preserve">Deletion: </w:t>
       </w:r>
       <w:r>
@@ -1314,7 +1383,7 @@
     </w:p>
     <w:p>
       <w:pPr>
-        <w:pStyle w:val="Heading2"/>
+        <w:pStyle w:val="2"/>
       </w:pPr>
       <w:r>
         <w:t>Identify</w:t>
@@ -1325,7 +1394,7 @@
     </w:p>
     <w:p>
       <w:pPr>
-        <w:pStyle w:val="BodyText"/>
+        <w:pStyle w:val="a3"/>
       </w:pPr>
       <w:r>
         <w:t>Headings, or heads, are organizational devices that guide the reader through your paper. There are two types: component heads and text heads.</w:t>
@@ -1333,7 +1402,7 @@
     </w:p>
     <w:p>
       <w:pPr>
-        <w:pStyle w:val="BodyText"/>
+        <w:pStyle w:val="a3"/>
       </w:pPr>
       <w:r>
         <w:t>Component heads identify the different components of your paper and are not topically subordinate to each other. Examples include Acknowledgments and References and, for these, the correct style to use is “Heading 5”. Use “figure caption” for your Figure captions, and “table head” for your table title. Run-in heads, such as “Abstract”, will require you to apply a style (in this case, italic) in addition to the style provided by the drop down menu to differentiate the head from the text.</w:t>
@@ -1341,15 +1410,19 @@
     </w:p>
     <w:p>
       <w:pPr>
-        <w:pStyle w:val="BodyText"/>
-      </w:pPr>
-      <w:r>
-        <w:t>Text heads organize the topics on a relational, hierarchical basis. For example, the paper title is the primary text head because all subsequent material relates and elaborates on this one topic. If there are two or more sub-topics, the next level head (uppercase Roman numerals) should be used and, conversely, if there are not at least two sub-topics, then no subheads should be introduced. Styles named “Heading 1”, “Heading 2”, “Heading 3”, and “Heading 4” are prescribed.</w:t>
-      </w:r>
-    </w:p>
-    <w:p>
-      <w:pPr>
-        <w:pStyle w:val="Heading2"/>
+        <w:pStyle w:val="a3"/>
+      </w:pPr>
+      <w:r>
+        <w:t xml:space="preserve">Text heads organize the topics on a relational, hierarchical basis. For example, the paper title is the primary text head because all subsequent material relates and elaborates on this one topic. If there are two or more sub-topics, the next level </w:t>
+      </w:r>
+      <w:r>
+        <w:lastRenderedPageBreak/>
+        <w:t>head (uppercase Roman numerals) should be used and, conversely, if there are not at least two sub-topics, then no subheads should be introduced. Styles named “Heading 1”, “Heading 2”, “Heading 3”, and “Heading 4” are prescribed.</w:t>
+      </w:r>
+    </w:p>
+    <w:p>
+      <w:pPr>
+        <w:pStyle w:val="2"/>
       </w:pPr>
       <w:r>
         <w:t>Figures and Tables</w:t>
@@ -1357,7 +1430,7 @@
     </w:p>
     <w:p>
       <w:pPr>
-        <w:pStyle w:val="Heading4"/>
+        <w:pStyle w:val="4"/>
       </w:pPr>
       <w:r>
         <w:t xml:space="preserve"> </w:t>
@@ -1649,7 +1722,7 @@
     </w:p>
     <w:p>
       <w:pPr>
-        <w:pStyle w:val="BodyText"/>
+        <w:pStyle w:val="a3"/>
       </w:pPr>
       <w:r>
         <w:t>Figure Labels: Use 8 point Times New Roman for Figure labels. Use words rather than symbols or abbreviations when writing Figure axis labels to avoid confusing the reader. As an example, write the quantity “Magnetization”, or “Magnetization, M”, not just “M”. If including units in the label, present them within parentheses. Do not label axes only with units. In the example, write “Magnetization (A/m)” or “Magnetization {A[m(1)]}”, not just “A/m”. Do not label axes</w:t>
@@ -1663,7 +1736,7 @@
     </w:p>
     <w:p>
       <w:pPr>
-        <w:pStyle w:val="Heading5"/>
+        <w:pStyle w:val="5"/>
       </w:pPr>
       <w:r>
         <w:t>Acknowledgment</w:t>
@@ -1696,7 +1769,7 @@
     </w:p>
     <w:p>
       <w:pPr>
-        <w:pStyle w:val="BodyText"/>
+        <w:pStyle w:val="a3"/>
       </w:pPr>
       <w:r>
         <w:t>The preferred spelling of the word “acknowledgment” in America is without an “e” after the “g</w:t>
@@ -1714,7 +1787,10 @@
         <w:t xml:space="preserve">ne of us (R. B. G.) thanks </w:t>
       </w:r>
       <w:r>
-        <w:t>...</w:t>
+        <w:t>.</w:t>
+      </w:r>
+      <w:r>
+        <w:t>.</w:t>
       </w:r>
       <w:r>
         <w:rPr>
@@ -1726,7 +1802,10 @@
         <w:t>Instead, try “R. B. G. thanks</w:t>
       </w:r>
       <w:r>
-        <w:t>...</w:t>
+        <w:t>.</w:t>
+      </w:r>
+      <w:r>
+        <w:t>.</w:t>
       </w:r>
       <w:r>
         <w:t>”.</w:t>
@@ -1749,7 +1828,7 @@
     </w:p>
     <w:p>
       <w:pPr>
-        <w:pStyle w:val="Heading5"/>
+        <w:pStyle w:val="5"/>
       </w:pPr>
       <w:r>
         <w:t>References</w:t>
@@ -1757,7 +1836,7 @@
     </w:p>
     <w:p>
       <w:pPr>
-        <w:pStyle w:val="BodyText"/>
+        <w:pStyle w:val="a3"/>
       </w:pPr>
       <w:r>
         <w:t>The template will number citations consecutively within brackets [1]. The sentence punctuation follows the bracket [2]. Refer simply to the reference number, as in [3]—do not use “Ref. [3]” or “reference [3]” except at the beginning of a sentence: “Reference [3] was the first</w:t>
@@ -1769,7 +1848,10 @@
         <w:t xml:space="preserve"> </w:t>
       </w:r>
       <w:r>
-        <w:t>...</w:t>
+        <w:t>.</w:t>
+      </w:r>
+      <w:r>
+        <w:t>.</w:t>
       </w:r>
       <w:r>
         <w:t>”</w:t>
@@ -1777,7 +1859,7 @@
     </w:p>
     <w:p>
       <w:pPr>
-        <w:pStyle w:val="BodyText"/>
+        <w:pStyle w:val="a3"/>
       </w:pPr>
       <w:r>
         <w:t>Number footnotes separately in superscripts. Place the actual footnote at the bottom of the column in which it was cited. Do not put footnotes in the</w:t>
@@ -1794,7 +1876,7 @@
     </w:p>
     <w:p>
       <w:pPr>
-        <w:pStyle w:val="BodyText"/>
+        <w:pStyle w:val="a3"/>
       </w:pPr>
       <w:r>
         <w:t>Unless there are six au</w:t>
@@ -1814,7 +1896,7 @@
     </w:p>
     <w:p>
       <w:pPr>
-        <w:pStyle w:val="BodyText"/>
+        <w:pStyle w:val="a3"/>
       </w:pPr>
       <w:r>
         <w:t xml:space="preserve">For </w:t>
@@ -2000,7 +2082,7 @@
                     <wne:txbxContent>
                       <w:p>
                         <w:pPr>
-                          <w:pStyle w:val="BodyText"/>
+                          <w:pStyle w:val="a3"/>
                         </w:pPr>
                         <w:r>
                           <w:t>We suggest that you use a text box to insert a graphic (which is ideally a 300 dpi TIFF or EPS file, with all fonts embedded) because, in an MSW document, this method is somewhat more stable than directly inserting a picture.</w:t>
@@ -2008,7 +2090,7 @@
                       </w:p>
                       <w:p>
                         <w:pPr>
-                          <w:pStyle w:val="BodyText"/>
+                          <w:pStyle w:val="a3"/>
                         </w:pPr>
                         <w:r>
                           <w:t>To have non-visible rules on your frame, use the MSWord “Format” pull-down menu, select Text Box &gt; Colors and Lines to choose No Fill and No Line.</w:t>
@@ -2066,7 +2148,7 @@
 <w:ftr xmlns:cx="http://schemas.microsoft.com/office/drawing/2014/chartex" xmlns:cx1="http://schemas.microsoft.com/office/drawing/2015/9/8/chartex" xmlns:cx2="http://schemas.microsoft.com/office/drawing/2015/10/21/chartex" xmlns:cx3="http://schemas.microsoft.com/office/drawing/2016/5/9/chartex" xmlns:cx4="http://schemas.microsoft.com/office/drawing/2016/5/10/chartex" xmlns:cx5="http://schemas.microsoft.com/office/drawing/2016/5/11/chartex" xmlns:cx6="http://schemas.microsoft.com/office/drawing/2016/5/12/chartex" xmlns:cx7="http://schemas.microsoft.com/office/drawing/2016/5/13/chartex" xmlns:cx8="http://schemas.microsoft.com/office/drawing/2016/5/14/chartex" xmlns:mc="http://schemas.openxmlformats.org/markup-compatibility/2006" xmlns:aink="http://schemas.microsoft.com/office/drawing/2016/ink" xmlns:am3d="http://schemas.microsoft.com/office/drawing/2017/model3d" xmlns:o="urn:schemas-microsoft-com:office:office" xmlns:oel="http://schemas.microsoft.com/office/2019/extlst" xmlns:r="http://purl.oclc.org/ooxml/officeDocument/relationships" xmlns:m="http://purl.oclc.org/ooxml/officeDocument/math" xmlns:v="urn:schemas-microsoft-com:vml" xmlns:wp14="http://schemas.microsoft.com/office/word/2010/wordprocessingDrawing" xmlns:wp="http://purl.oclc.org/ooxml/drawingml/wordprocessingDrawing" xmlns:w10="urn:schemas-microsoft-com:office:word" xmlns:w="http://purl.oclc.org/ooxml/wordprocessingml/main" xmlns:w14="http://schemas.microsoft.com/office/word/2010/wordml" xmlns:w15="http://schemas.microsoft.com/office/word/2012/wordml" xmlns:w16cex="http://schemas.microsoft.com/office/word/2018/wordml/cex" xmlns:w16cid="http://schemas.microsoft.com/office/word/2016/wordml/cid" xmlns:w16="http://schemas.microsoft.com/office/word/2018/wordml" xmlns:w16du="http://schemas.microsoft.com/office/word/2023/wordml/word16du" xmlns:w16sdtdh="http://schemas.microsoft.com/office/word/2020/wordml/sdtdatahash" xmlns:w16sdtfl="http://schemas.microsoft.com/office/word/2024/wordml/sdtformatlock" xmlns:w16se="http://schemas.microsoft.com/office/word/2015/wordml/symex" xmlns:wpi="http://schemas.microsoft.com/office/word/2010/wordprocessingInk" xmlns:wne="http://schemas.microsoft.com/office/word/2006/wordml" mc:Ignorable="w14 w15 w16se w16cid w16 w16cex w16sdtdh w16sdtfl w16du wne wp14">
   <w:p>
     <w:pPr>
-      <w:pStyle w:val="Footer"/>
+      <w:pStyle w:val="a7"/>
       <w:jc w:val="start"/>
       <w:rPr>
         <w:sz w:val="16"/>
@@ -2987,7 +3069,7 @@
     <w:lvl w:ilvl="0">
       <w:start w:val="1"/>
       <w:numFmt w:val="upperRoman"/>
-      <w:pStyle w:val="Heading1"/>
+      <w:pStyle w:val="1"/>
       <w:lvlText w:val="%1."/>
       <w:lvlJc w:val="center"/>
       <w:pPr>
@@ -3019,7 +3101,7 @@
     <w:lvl w:ilvl="1">
       <w:start w:val="1"/>
       <w:numFmt w:val="upperLetter"/>
-      <w:pStyle w:val="Heading2"/>
+      <w:pStyle w:val="2"/>
       <w:lvlText w:val="%2."/>
       <w:lvlJc w:val="start"/>
       <w:pPr>
@@ -3055,7 +3137,7 @@
     <w:lvl w:ilvl="2">
       <w:start w:val="1"/>
       <w:numFmt w:val="decimal"/>
-      <w:pStyle w:val="Heading3"/>
+      <w:pStyle w:val="3"/>
       <w:lvlText w:val="%3)"/>
       <w:lvlJc w:val="start"/>
       <w:pPr>
@@ -3091,7 +3173,7 @@
     <w:lvl w:ilvl="3">
       <w:start w:val="1"/>
       <w:numFmt w:val="lowerLetter"/>
-      <w:pStyle w:val="Heading4"/>
+      <w:pStyle w:val="4"/>
       <w:lvlText w:val="%4)"/>
       <w:lvlJc w:val="start"/>
       <w:pPr>
@@ -3863,17 +3945,17 @@
     <w:lsdException w:name="Unresolved Mention" w:semiHidden="1" w:uiPriority="99" w:unhideWhenUsed="1"/>
     <w:lsdException w:name="Smart Link" w:semiHidden="1" w:uiPriority="99" w:unhideWhenUsed="1"/>
   </w:latentStyles>
-  <w:style w:type="paragraph" w:default="1" w:styleId="Normal">
+  <w:style w:type="paragraph" w:default="1" w:styleId="a">
     <w:name w:val="Normal"/>
     <w:qFormat/>
     <w:pPr>
       <w:jc w:val="center"/>
     </w:pPr>
   </w:style>
-  <w:style w:type="paragraph" w:styleId="Heading1">
+  <w:style w:type="paragraph" w:styleId="1">
     <w:name w:val="heading 1"/>
-    <w:basedOn w:val="Normal"/>
-    <w:next w:val="Normal"/>
+    <w:basedOn w:val="a"/>
+    <w:next w:val="a"/>
     <w:qFormat/>
     <w:rsid w:val="006B6B66"/>
     <w:pPr>
@@ -3894,10 +3976,10 @@
       <w:noProof/>
     </w:rPr>
   </w:style>
-  <w:style w:type="paragraph" w:styleId="Heading2">
+  <w:style w:type="paragraph" w:styleId="2">
     <w:name w:val="heading 2"/>
-    <w:basedOn w:val="Normal"/>
-    <w:next w:val="Normal"/>
+    <w:basedOn w:val="a"/>
+    <w:next w:val="a"/>
     <w:qFormat/>
     <w:rsid w:val="00ED0149"/>
     <w:pPr>
@@ -3921,10 +4003,10 @@
       <w:noProof/>
     </w:rPr>
   </w:style>
-  <w:style w:type="paragraph" w:styleId="Heading3">
+  <w:style w:type="paragraph" w:styleId="3">
     <w:name w:val="heading 3"/>
-    <w:basedOn w:val="Normal"/>
-    <w:next w:val="Normal"/>
+    <w:basedOn w:val="a"/>
+    <w:next w:val="a"/>
     <w:qFormat/>
     <w:rsid w:val="00794804"/>
     <w:pPr>
@@ -3943,10 +4025,10 @@
       <w:noProof/>
     </w:rPr>
   </w:style>
-  <w:style w:type="paragraph" w:styleId="Heading4">
+  <w:style w:type="paragraph" w:styleId="4">
     <w:name w:val="heading 4"/>
-    <w:basedOn w:val="Normal"/>
-    <w:next w:val="Normal"/>
+    <w:basedOn w:val="a"/>
+    <w:next w:val="a"/>
     <w:qFormat/>
     <w:rsid w:val="00794804"/>
     <w:pPr>
@@ -3969,10 +4051,10 @@
       <w:noProof/>
     </w:rPr>
   </w:style>
-  <w:style w:type="paragraph" w:styleId="Heading5">
+  <w:style w:type="paragraph" w:styleId="5">
     <w:name w:val="heading 5"/>
-    <w:basedOn w:val="Normal"/>
-    <w:next w:val="Normal"/>
+    <w:basedOn w:val="a"/>
+    <w:next w:val="a"/>
     <w:qFormat/>
     <w:pPr>
       <w:tabs>
@@ -3986,12 +4068,13 @@
       <w:noProof/>
     </w:rPr>
   </w:style>
-  <w:style w:type="character" w:default="1" w:styleId="DefaultParagraphFont">
+  <w:style w:type="character" w:default="1" w:styleId="a0">
     <w:name w:val="Default Paragraph Font"/>
     <w:uiPriority w:val="1"/>
+    <w:semiHidden/>
     <w:unhideWhenUsed/>
   </w:style>
-  <w:style w:type="table" w:default="1" w:styleId="TableNormal">
+  <w:style w:type="table" w:default="1" w:styleId="a1">
     <w:name w:val="Normal Table"/>
     <w:uiPriority w:val="99"/>
     <w:semiHidden/>
@@ -4006,7 +4089,7 @@
       </w:tblCellMar>
     </w:tblPr>
   </w:style>
-  <w:style w:type="numbering" w:default="1" w:styleId="NoList">
+  <w:style w:type="numbering" w:default="1" w:styleId="a2">
     <w:name w:val="No List"/>
     <w:uiPriority w:val="99"/>
     <w:semiHidden/>
@@ -4045,10 +4128,10 @@
       <w:szCs w:val="22"/>
     </w:rPr>
   </w:style>
-  <w:style w:type="paragraph" w:styleId="BodyText">
+  <w:style w:type="paragraph" w:styleId="a3">
     <w:name w:val="Body Text"/>
-    <w:basedOn w:val="Normal"/>
-    <w:link w:val="BodyTextChar"/>
+    <w:basedOn w:val="a"/>
+    <w:link w:val="a4"/>
     <w:rsid w:val="00E7596C"/>
     <w:pPr>
       <w:tabs>
@@ -4063,9 +4146,9 @@
       <w:lang w:val="x-none" w:eastAsia="x-none"/>
     </w:rPr>
   </w:style>
-  <w:style w:type="character" w:customStyle="1" w:styleId="BodyTextChar">
-    <w:name w:val="Body Text Char"/>
-    <w:link w:val="BodyText"/>
+  <w:style w:type="character" w:customStyle="1" w:styleId="a4">
+    <w:name w:val="גוף טקסט תו"/>
+    <w:link w:val="a3"/>
     <w:rsid w:val="00E7596C"/>
     <w:rPr>
       <w:spacing w:val="-1"/>
@@ -4074,7 +4157,7 @@
   </w:style>
   <w:style w:type="paragraph" w:customStyle="1" w:styleId="bulletlist">
     <w:name w:val="bullet list"/>
-    <w:basedOn w:val="BodyText"/>
+    <w:basedOn w:val="a3"/>
     <w:rsid w:val="001B67DC"/>
     <w:pPr>
       <w:numPr>
@@ -4088,7 +4171,7 @@
   </w:style>
   <w:style w:type="paragraph" w:customStyle="1" w:styleId="equation">
     <w:name w:val="equation"/>
-    <w:basedOn w:val="Normal"/>
+    <w:basedOn w:val="a"/>
     <w:rsid w:val="008A2C7D"/>
     <w:pPr>
       <w:tabs>
@@ -4193,7 +4276,7 @@
   </w:style>
   <w:style w:type="paragraph" w:customStyle="1" w:styleId="tablecolhead">
     <w:name w:val="table col head"/>
-    <w:basedOn w:val="Normal"/>
+    <w:basedOn w:val="a"/>
     <w:rPr>
       <w:b/>
       <w:bCs/>
@@ -4267,10 +4350,10 @@
       <w:i/>
     </w:rPr>
   </w:style>
-  <w:style w:type="paragraph" w:styleId="Header">
+  <w:style w:type="paragraph" w:styleId="a5">
     <w:name w:val="header"/>
-    <w:basedOn w:val="Normal"/>
-    <w:link w:val="HeaderChar"/>
+    <w:basedOn w:val="a"/>
+    <w:link w:val="a6"/>
     <w:rsid w:val="001A3B3D"/>
     <w:pPr>
       <w:tabs>
@@ -4279,16 +4362,16 @@
       </w:tabs>
     </w:pPr>
   </w:style>
-  <w:style w:type="character" w:customStyle="1" w:styleId="HeaderChar">
-    <w:name w:val="Header Char"/>
-    <w:basedOn w:val="DefaultParagraphFont"/>
-    <w:link w:val="Header"/>
+  <w:style w:type="character" w:customStyle="1" w:styleId="a6">
+    <w:name w:val="כותרת עליונה תו"/>
+    <w:basedOn w:val="a0"/>
+    <w:link w:val="a5"/>
     <w:rsid w:val="001A3B3D"/>
   </w:style>
-  <w:style w:type="paragraph" w:styleId="Footer">
+  <w:style w:type="paragraph" w:styleId="a7">
     <w:name w:val="footer"/>
-    <w:basedOn w:val="Normal"/>
-    <w:link w:val="FooterChar"/>
+    <w:basedOn w:val="a"/>
+    <w:link w:val="a8"/>
     <w:rsid w:val="001A3B3D"/>
     <w:pPr>
       <w:tabs>
@@ -4297,10 +4380,10 @@
       </w:tabs>
     </w:pPr>
   </w:style>
-  <w:style w:type="character" w:customStyle="1" w:styleId="FooterChar">
-    <w:name w:val="Footer Char"/>
-    <w:basedOn w:val="DefaultParagraphFont"/>
-    <w:link w:val="Footer"/>
+  <w:style w:type="character" w:customStyle="1" w:styleId="a8">
+    <w:name w:val="כותרת תחתונה תו"/>
+    <w:basedOn w:val="a0"/>
+    <w:link w:val="a7"/>
     <w:rsid w:val="001A3B3D"/>
   </w:style>
 </w:styles>

</xml_diff>